<commit_message>
Add HLD architecture + API reference to report, deck, and docs
- Remove em dashes from the Word report
- Add HLD architecture diagram (make_hld.py) used in both documents
- Report: appendix with system architecture + API reference table
- Deck: new System Architecture (HLD) and API-at-a-glance slides (10 total)
- Add docs/api_reference.md

Co-Authored-By: Claude Opus 4.8 <noreply@anthropic.com>
</commit_message>
<xml_diff>
--- a/deliverables/Nitish_Kumar_Report.docx
+++ b/deliverables/Nitish_Kumar_Report.docx
@@ -43,7 +43,7 @@
           <w:color w:val="C4007A"/>
           <w:sz w:val="24"/>
         </w:rPr>
-        <w:t>Past, Present, &amp; Future Approaches — NLP, OCR, Computer Vision, LLMs &amp; LMMs</w:t>
+        <w:t>Past, Present, and Future Approaches: NLP, OCR, Computer Vision, LLMs &amp; LMMs</w:t>
       </w:r>
     </w:p>
     <w:p>
@@ -84,7 +84,7 @@
         <w:jc w:val="both"/>
       </w:pPr>
       <w:r>
-        <w:t>Clinical Natural Language Technology refers to the family of computational methods that convert unstructured clinical information—physician notes, discharge summaries, scanned faxes, and medical images—into structured, machine-actionable data. An estimated 80% of health data is unstructured, trapped in free text and imaging where it cannot be directly queried, coded, or audited. The discipline spans four complementary technologies: Natural Language Processing (NLP) for extracting entities and relations from text; Optical Character Recognition (OCR) for digitizing scanned and faxed documents; Computer Vision (CV) for interpreting medical images; and, most recently, Large Language Models (LLMs) and Large Multimodal Models (LMMs) that reason jointly over text and images. Together these methods turn narrative clinical content into the codes, features, and evidence that payment integrity and quality programs depend on.</w:t>
+        <w:t>Clinical Natural Language Technology refers to the family of computational methods that convert unstructured clinical information (physician notes, discharge summaries, scanned faxes, and medical images) into structured data that computers can use. An estimated 80% of health data is unstructured, trapped in free text and imaging where it cannot be directly searched, coded, or audited. The discipline spans four complementary technologies: Natural Language Processing (NLP) for extracting entities and relations from text; Optical Character Recognition (OCR) for digitizing scanned and faxed documents; Computer Vision (CV) for interpreting medical images; and, most recently, Large Language Models (LLMs) and Large Multimodal Models (LMMs) that reason jointly over text and images. Together these methods turn narrative clinical content into the codes, features, and evidence that payment integrity and quality programs depend on.</w:t>
       </w:r>
     </w:p>
     <w:p>
@@ -110,7 +110,7 @@
         <w:jc w:val="both"/>
       </w:pPr>
       <w:r>
-        <w:t>The field has moved through three eras. The past (2000–2017) was dominated by rule-based and dictionary systems such as cTAKES and MetaMap that mapped text to ontologies (UMLS, SNOMED CT, ICD) using hand-crafted patterns—accurate but brittle and expensive to maintain. The present (2018–2023) is defined by transformer-based transfer learning: domain-pretrained encoders such as BioBERT, ClinicalBERT, and GatorTron dramatically improved named-entity recognition, de-identification, and phenotyping, while vision models like DenseNet and Vision Transformers reached expert-level performance on chest-radiograph classification. The emerging future (2024 onward) is generative and multimodal: clinical LLMs (Med-PaLM 2, GPT-class models) encode broad medical knowledge, and LMMs fuse image and text so a single model can read an X-ray and draft a narrative report. Retrieval-Augmented Generation (RAG) has become the dominant pattern for grounding these models in verified clinical sources and controlling hallucination—a prerequisite for regulated healthcare use.</w:t>
+        <w:t>The field has moved through three eras. The past (2000 to 2017) was dominated by rule-based and dictionary systems such as cTAKES and MetaMap that mapped text to ontologies (UMLS, SNOMED CT, ICD) using hand-written rules. These were accurate but brittle and expensive to maintain. The present (2018 to 2023) is defined by transformer-based transfer learning: domain-pretrained encoders such as BioBERT, ClinicalBERT, and GatorTron dramatically improved named-entity recognition, de-identification, and phenotyping, while vision models like DenseNet and Vision Transformers reached expert-level performance on chest-radiograph classification. The emerging future (2024 onward) is generative and multimodal: clinical LLMs (Med-PaLM 2, GPT-class models) encode broad medical knowledge, and LMMs fuse image and text so a single model can read an X-ray and draft a narrative report. Retrieval-Augmented Generation (RAG) has become the dominant pattern for grounding these models in verified clinical sources and controlling hallucination (made-up facts), which is a prerequisite for regulated healthcare use.</w:t>
       </w:r>
     </w:p>
     <w:p>
@@ -145,7 +145,7 @@
         <w:t xml:space="preserve">Automated coding &amp; payment integrity: </w:t>
       </w:r>
       <w:r>
-        <w:t>extracting diagnoses, procedures, and supporting evidence from notes to detect miscoding, upcoding, and documentation gaps at scale—directly aligned with Cotiviti's core business.</w:t>
+        <w:t>extracting diagnoses, procedures, and supporting evidence from notes to detect miscoding, upcoding, and documentation gaps at scale, directly aligned with Cotiviti's core business.</w:t>
       </w:r>
     </w:p>
     <w:p>
@@ -274,7 +274,7 @@
         <w:jc w:val="both"/>
       </w:pPr>
       <w:r>
-        <w:t>First, invest in a grounded clinical-NLP layer built on RAG: pair domain-pretrained encoders (ClinicalBERT/GatorTron) with a governed vector store of coding policies and clinical guidelines so every AI-generated code or flag is traceable to an authoritative source. Second, pilot multimodal document understanding—combining OCR, NLP, and computer vision—to reconcile imaging and note evidence against submitted claims. Third, adopt a human-in-the-loop MLOps discipline (versioning, calibration, drift monitoring, and confidence-gated escalation) so automation augments rather than replaces expert reviewers. These positions let Cotiviti capture efficiency gains while meeting the accuracy, explainability, and compliance bar that healthcare payment integrity demands.</w:t>
+        <w:t>First, invest in a grounded clinical-NLP layer built on RAG: pair domain-pretrained encoders (ClinicalBERT/GatorTron) with a governed vector store of coding policies and clinical guidelines so every AI-generated code or flag is traceable to an authoritative source. Second, pilot multimodal document understanding (combining OCR, NLP, and computer vision) to reconcile imaging and note evidence against submitted claims. Third, adopt a human-in-the-loop MLOps discipline (versioning, calibration, drift monitoring, and confidence-gated escalation) so automation augments rather than replaces expert reviewers. These positions let Cotiviti capture efficiency gains while meeting the accuracy, explainability, and compliance bar that healthcare payment integrity demands.</w:t>
       </w:r>
     </w:p>
     <w:p>
@@ -300,7 +300,7 @@
         <w:jc w:val="both"/>
       </w:pPr>
       <w:r>
-        <w:t>The accompanying prototype, an automated Chest X-Ray Report Generation System, demonstrates these principles end to end. A DenseNet-121 vision encoder converts an X-ray (JPEG, PNG, or DICOM) into a feature vector that a Transformer decoder turns into a narrative radiology report—illustrating the Computer Vision and NLP pipeline. A RAG clinical agent (ClinicalBERT embeddings + ChromaDB vector store + a LangChain ReAct loop) then answers clinical questions with a step-by-step reasoning trace grounded in retrieved cases, showing how LLM/LMM techniques can be made auditable. The system is wrapped in a production-style MLOps stack (FastAPI, Celery, Prometheus, OpenTelemetry, Docker) and a four-tab Gradio UI, proving the concept from model to deployable service. It is a research demonstrator and is not FDA-cleared for clinical use.</w:t>
+        <w:t>The accompanying prototype, an automated Chest X-Ray Report Generation System, demonstrates these principles end to end. A DenseNet-121 vision encoder converts an X-ray (JPEG, PNG, or DICOM) into a feature vector that a Transformer decoder turns into a narrative radiology report, illustrating the Computer Vision and NLP pipeline. A RAG clinical agent (ClinicalBERT embeddings + ChromaDB vector store + a LangChain ReAct loop) then answers clinical questions with a step-by-step reasoning trace grounded in retrieved cases, showing how LLM/LMM techniques can be made auditable. The system is wrapped in a production-style MLOps stack (FastAPI, Celery, Prometheus, OpenTelemetry, Docker) and a four-tab Gradio UI, proving the concept from model to deployable service. It is a research demonstrator and is not FDA-cleared for clinical use.</w:t>
       </w:r>
     </w:p>
     <w:p>
@@ -480,6 +480,981 @@
           <w:sz w:val="20"/>
         </w:rPr>
         <w:t>Yang, X., Chen, A., PourNejatian, N., Shin, H. C., Smith, K. E., Parisien, C., ... Wu, Y. (2022). A large language model for electronic health records. npj Digital Medicine, 5, 194.</w:t>
+      </w:r>
+    </w:p>
+    <w:p>
+      <w:r>
+        <w:br w:type="page"/>
+      </w:r>
+    </w:p>
+    <w:p>
+      <w:pPr>
+        <w:spacing w:before="200" w:after="60"/>
+        <w:pBdr>
+          <w:bottom w:val="single" w:sz="8" w:space="4" w:color="C4007A"/>
+        </w:pBdr>
+      </w:pPr>
+      <w:r>
+        <w:rPr>
+          <w:rFonts w:ascii="Calibri" w:hAnsi="Calibri"/>
+          <w:b/>
+          <w:caps/>
+          <w:color w:val="4B2E83"/>
+          <w:sz w:val="24"/>
+        </w:rPr>
+        <w:t>APPENDIX A: SYSTEM ARCHITECTURE (HIGH-LEVEL DESIGN)</w:t>
+      </w:r>
+    </w:p>
+    <w:p>
+      <w:pPr>
+        <w:jc w:val="both"/>
+      </w:pPr>
+      <w:r>
+        <w:t>The proof of concept is organized in four layers. Client interfaces (a Gradio UI, Swagger, and REST clients) call a FastAPI service, which routes requests to the model, DICOM, RAG, and async services; these read from the vector store, model weights, and vocabulary.</w:t>
+      </w:r>
+    </w:p>
+    <w:p>
+      <w:pPr>
+        <w:spacing w:before="40" w:after="40"/>
+        <w:jc w:val="center"/>
+      </w:pPr>
+      <w:r>
+        <w:drawing>
+          <wp:inline xmlns:a="http://schemas.openxmlformats.org/drawingml/2006/main" xmlns:pic="http://schemas.openxmlformats.org/drawingml/2006/picture">
+            <wp:extent cx="5577840" cy="3053775"/>
+            <wp:docPr id="1" name="Picture 1"/>
+            <wp:cNvGraphicFramePr>
+              <a:graphicFrameLocks noChangeAspect="1"/>
+            </wp:cNvGraphicFramePr>
+            <a:graphic>
+              <a:graphicData uri="http://schemas.openxmlformats.org/drawingml/2006/picture">
+                <pic:pic>
+                  <pic:nvPicPr>
+                    <pic:cNvPr id="0" name="hld_architecture.png"/>
+                    <pic:cNvPicPr/>
+                  </pic:nvPicPr>
+                  <pic:blipFill>
+                    <a:blip r:embed="rId9"/>
+                    <a:stretch>
+                      <a:fillRect/>
+                    </a:stretch>
+                  </pic:blipFill>
+                  <pic:spPr>
+                    <a:xfrm>
+                      <a:off x="0" y="0"/>
+                      <a:ext cx="5577840" cy="3053775"/>
+                    </a:xfrm>
+                    <a:prstGeom prst="rect"/>
+                  </pic:spPr>
+                </pic:pic>
+              </a:graphicData>
+            </a:graphic>
+          </wp:inline>
+        </w:drawing>
+      </w:r>
+    </w:p>
+    <w:p>
+      <w:pPr>
+        <w:jc w:val="center"/>
+      </w:pPr>
+      <w:r>
+        <w:rPr>
+          <w:i/>
+          <w:color w:val="666666"/>
+          <w:sz w:val="18"/>
+        </w:rPr>
+        <w:t>Figure 1. High-level design of the Chest X-Ray Report Generation System.</w:t>
+      </w:r>
+    </w:p>
+    <w:p>
+      <w:pPr>
+        <w:spacing w:before="200" w:after="60"/>
+        <w:pBdr>
+          <w:bottom w:val="single" w:sz="8" w:space="4" w:color="C4007A"/>
+        </w:pBdr>
+      </w:pPr>
+      <w:r>
+        <w:rPr>
+          <w:rFonts w:ascii="Calibri" w:hAnsi="Calibri"/>
+          <w:b/>
+          <w:caps/>
+          <w:color w:val="4B2E83"/>
+          <w:sz w:val="24"/>
+        </w:rPr>
+        <w:t>APPENDIX B: API REFERENCE (SURFACE LEVEL)</w:t>
+      </w:r>
+    </w:p>
+    <w:p>
+      <w:pPr>
+        <w:jc w:val="both"/>
+      </w:pPr>
+      <w:r>
+        <w:t>The system exposes a REST API built with FastAPI; full interactive documentation is auto-generated at /docs (Swagger). The core endpoints are summarized below.</w:t>
+      </w:r>
+    </w:p>
+    <w:tbl>
+      <w:tblPr>
+        <w:tblStyle w:val="TableGrid"/>
+        <w:tblW w:type="auto" w:w="0"/>
+        <w:tblLayout w:type="fixed"/>
+        <w:tblLook w:firstColumn="1" w:firstRow="1" w:lastColumn="0" w:lastRow="0" w:noHBand="0" w:noVBand="1" w:val="04A0"/>
+      </w:tblPr>
+      <w:tblGrid>
+        <w:gridCol w:w="3264"/>
+        <w:gridCol w:w="3264"/>
+        <w:gridCol w:w="3264"/>
+      </w:tblGrid>
+      <w:tr>
+        <w:tc>
+          <w:tcPr>
+            <w:tcW w:type="dxa" w:w="1296"/>
+            <w:shd w:val="clear" w:color="auto" w:fill="4B2E83"/>
+          </w:tcPr>
+          <w:p>
+            <w:pPr>
+              <w:spacing w:after="20" w:before="20"/>
+            </w:pPr>
+            <w:r>
+              <w:rPr>
+                <w:rFonts w:ascii="Calibri" w:hAnsi="Calibri"/>
+                <w:b/>
+                <w:color w:val="FFFFFF"/>
+                <w:sz w:val="19"/>
+              </w:rPr>
+              <w:t>Method</w:t>
+            </w:r>
+          </w:p>
+        </w:tc>
+        <w:tc>
+          <w:tcPr>
+            <w:tcW w:type="dxa" w:w="3096"/>
+            <w:shd w:val="clear" w:color="auto" w:fill="4B2E83"/>
+          </w:tcPr>
+          <w:p>
+            <w:pPr>
+              <w:spacing w:after="20" w:before="20"/>
+            </w:pPr>
+            <w:r>
+              <w:rPr>
+                <w:rFonts w:ascii="Calibri" w:hAnsi="Calibri"/>
+                <w:b/>
+                <w:color w:val="FFFFFF"/>
+                <w:sz w:val="19"/>
+              </w:rPr>
+              <w:t>Endpoint</w:t>
+            </w:r>
+          </w:p>
+        </w:tc>
+        <w:tc>
+          <w:tcPr>
+            <w:tcW w:type="dxa" w:w="5256"/>
+            <w:shd w:val="clear" w:color="auto" w:fill="4B2E83"/>
+          </w:tcPr>
+          <w:p>
+            <w:pPr>
+              <w:spacing w:after="20" w:before="20"/>
+            </w:pPr>
+            <w:r>
+              <w:rPr>
+                <w:rFonts w:ascii="Calibri" w:hAnsi="Calibri"/>
+                <w:b/>
+                <w:color w:val="FFFFFF"/>
+                <w:sz w:val="19"/>
+              </w:rPr>
+              <w:t>Description</w:t>
+            </w:r>
+          </w:p>
+        </w:tc>
+      </w:tr>
+      <w:tr>
+        <w:tc>
+          <w:tcPr>
+            <w:tcW w:type="dxa" w:w="9648"/>
+            <w:gridSpan w:val="3"/>
+            <w:shd w:val="clear" w:color="auto" w:fill="EFE7FA"/>
+          </w:tcPr>
+          <w:p>
+            <w:pPr>
+              <w:spacing w:after="20" w:before="20"/>
+            </w:pPr>
+            <w:r>
+              <w:rPr>
+                <w:rFonts w:ascii="Calibri" w:hAnsi="Calibri"/>
+                <w:b/>
+                <w:color w:val="4B2E83"/>
+                <w:sz w:val="18"/>
+              </w:rPr>
+              <w:t>SYSTEM</w:t>
+            </w:r>
+          </w:p>
+        </w:tc>
+      </w:tr>
+      <w:tr>
+        <w:tc>
+          <w:tcPr>
+            <w:tcW w:type="dxa" w:w="1296"/>
+          </w:tcPr>
+          <w:p>
+            <w:pPr>
+              <w:spacing w:after="20" w:before="20"/>
+            </w:pPr>
+            <w:r>
+              <w:rPr>
+                <w:rFonts w:ascii="Consolas" w:hAnsi="Consolas"/>
+                <w:b/>
+                <w:color w:val="C4007A"/>
+                <w:sz w:val="18"/>
+              </w:rPr>
+              <w:t>GET</w:t>
+            </w:r>
+          </w:p>
+        </w:tc>
+        <w:tc>
+          <w:tcPr>
+            <w:tcW w:type="dxa" w:w="3096"/>
+          </w:tcPr>
+          <w:p>
+            <w:pPr>
+              <w:spacing w:after="20" w:before="20"/>
+            </w:pPr>
+            <w:r>
+              <w:rPr>
+                <w:rFonts w:ascii="Consolas" w:hAnsi="Consolas"/>
+                <w:b w:val="0"/>
+                <w:color w:val="222222"/>
+                <w:sz w:val="18"/>
+              </w:rPr>
+              <w:t>/health</w:t>
+            </w:r>
+          </w:p>
+        </w:tc>
+        <w:tc>
+          <w:tcPr>
+            <w:tcW w:type="dxa" w:w="5256"/>
+          </w:tcPr>
+          <w:p>
+            <w:pPr>
+              <w:spacing w:after="20" w:before="20"/>
+            </w:pPr>
+            <w:r>
+              <w:rPr>
+                <w:rFonts w:ascii="Calibri" w:hAnsi="Calibri"/>
+                <w:b w:val="0"/>
+                <w:color w:val="222222"/>
+                <w:sz w:val="18"/>
+              </w:rPr>
+              <w:t>Liveness probe and model-loaded status</w:t>
+            </w:r>
+          </w:p>
+        </w:tc>
+      </w:tr>
+      <w:tr>
+        <w:tc>
+          <w:tcPr>
+            <w:tcW w:type="dxa" w:w="1296"/>
+          </w:tcPr>
+          <w:p>
+            <w:pPr>
+              <w:spacing w:after="20" w:before="20"/>
+            </w:pPr>
+            <w:r>
+              <w:rPr>
+                <w:rFonts w:ascii="Consolas" w:hAnsi="Consolas"/>
+                <w:b/>
+                <w:color w:val="C4007A"/>
+                <w:sz w:val="18"/>
+              </w:rPr>
+              <w:t>GET</w:t>
+            </w:r>
+          </w:p>
+        </w:tc>
+        <w:tc>
+          <w:tcPr>
+            <w:tcW w:type="dxa" w:w="3096"/>
+          </w:tcPr>
+          <w:p>
+            <w:pPr>
+              <w:spacing w:after="20" w:before="20"/>
+            </w:pPr>
+            <w:r>
+              <w:rPr>
+                <w:rFonts w:ascii="Consolas" w:hAnsi="Consolas"/>
+                <w:b w:val="0"/>
+                <w:color w:val="222222"/>
+                <w:sz w:val="18"/>
+              </w:rPr>
+              <w:t>/metadata</w:t>
+            </w:r>
+          </w:p>
+        </w:tc>
+        <w:tc>
+          <w:tcPr>
+            <w:tcW w:type="dxa" w:w="5256"/>
+          </w:tcPr>
+          <w:p>
+            <w:pPr>
+              <w:spacing w:after="20" w:before="20"/>
+            </w:pPr>
+            <w:r>
+              <w:rPr>
+                <w:rFonts w:ascii="Calibri" w:hAnsi="Calibri"/>
+                <w:b w:val="0"/>
+                <w:color w:val="222222"/>
+                <w:sz w:val="18"/>
+              </w:rPr>
+              <w:t>Model architecture details (vocab size, dimensions, dataset)</w:t>
+            </w:r>
+          </w:p>
+        </w:tc>
+      </w:tr>
+      <w:tr>
+        <w:tc>
+          <w:tcPr>
+            <w:tcW w:type="dxa" w:w="1296"/>
+          </w:tcPr>
+          <w:p>
+            <w:pPr>
+              <w:spacing w:after="20" w:before="20"/>
+            </w:pPr>
+            <w:r>
+              <w:rPr>
+                <w:rFonts w:ascii="Consolas" w:hAnsi="Consolas"/>
+                <w:b/>
+                <w:color w:val="C4007A"/>
+                <w:sz w:val="18"/>
+              </w:rPr>
+              <w:t>GET</w:t>
+            </w:r>
+          </w:p>
+        </w:tc>
+        <w:tc>
+          <w:tcPr>
+            <w:tcW w:type="dxa" w:w="3096"/>
+          </w:tcPr>
+          <w:p>
+            <w:pPr>
+              <w:spacing w:after="20" w:before="20"/>
+            </w:pPr>
+            <w:r>
+              <w:rPr>
+                <w:rFonts w:ascii="Consolas" w:hAnsi="Consolas"/>
+                <w:b w:val="0"/>
+                <w:color w:val="222222"/>
+                <w:sz w:val="18"/>
+              </w:rPr>
+              <w:t>/metrics</w:t>
+            </w:r>
+          </w:p>
+        </w:tc>
+        <w:tc>
+          <w:tcPr>
+            <w:tcW w:type="dxa" w:w="5256"/>
+          </w:tcPr>
+          <w:p>
+            <w:pPr>
+              <w:spacing w:after="20" w:before="20"/>
+            </w:pPr>
+            <w:r>
+              <w:rPr>
+                <w:rFonts w:ascii="Calibri" w:hAnsi="Calibri"/>
+                <w:b w:val="0"/>
+                <w:color w:val="222222"/>
+                <w:sz w:val="18"/>
+              </w:rPr>
+              <w:t>Prometheus metrics (request counts, latency histogram)</w:t>
+            </w:r>
+          </w:p>
+        </w:tc>
+      </w:tr>
+      <w:tr>
+        <w:tc>
+          <w:tcPr>
+            <w:tcW w:type="dxa" w:w="9648"/>
+            <w:gridSpan w:val="3"/>
+            <w:shd w:val="clear" w:color="auto" w:fill="EFE7FA"/>
+          </w:tcPr>
+          <w:p>
+            <w:pPr>
+              <w:spacing w:after="20" w:before="20"/>
+            </w:pPr>
+            <w:r>
+              <w:rPr>
+                <w:rFonts w:ascii="Calibri" w:hAnsi="Calibri"/>
+                <w:b/>
+                <w:color w:val="4B2E83"/>
+                <w:sz w:val="18"/>
+              </w:rPr>
+              <w:t>INFERENCE</w:t>
+            </w:r>
+          </w:p>
+        </w:tc>
+      </w:tr>
+      <w:tr>
+        <w:tc>
+          <w:tcPr>
+            <w:tcW w:type="dxa" w:w="1296"/>
+          </w:tcPr>
+          <w:p>
+            <w:pPr>
+              <w:spacing w:after="20" w:before="20"/>
+            </w:pPr>
+            <w:r>
+              <w:rPr>
+                <w:rFonts w:ascii="Consolas" w:hAnsi="Consolas"/>
+                <w:b/>
+                <w:color w:val="C4007A"/>
+                <w:sz w:val="18"/>
+              </w:rPr>
+              <w:t>POST</w:t>
+            </w:r>
+          </w:p>
+        </w:tc>
+        <w:tc>
+          <w:tcPr>
+            <w:tcW w:type="dxa" w:w="3096"/>
+          </w:tcPr>
+          <w:p>
+            <w:pPr>
+              <w:spacing w:after="20" w:before="20"/>
+            </w:pPr>
+            <w:r>
+              <w:rPr>
+                <w:rFonts w:ascii="Consolas" w:hAnsi="Consolas"/>
+                <w:b w:val="0"/>
+                <w:color w:val="222222"/>
+                <w:sz w:val="18"/>
+              </w:rPr>
+              <w:t>/predict</w:t>
+            </w:r>
+          </w:p>
+        </w:tc>
+        <w:tc>
+          <w:tcPr>
+            <w:tcW w:type="dxa" w:w="5256"/>
+          </w:tcPr>
+          <w:p>
+            <w:pPr>
+              <w:spacing w:after="20" w:before="20"/>
+            </w:pPr>
+            <w:r>
+              <w:rPr>
+                <w:rFonts w:ascii="Calibri" w:hAnsi="Calibri"/>
+                <w:b w:val="0"/>
+                <w:color w:val="222222"/>
+                <w:sz w:val="18"/>
+              </w:rPr>
+              <w:t>Generate a report from a JPEG or PNG image</w:t>
+            </w:r>
+          </w:p>
+        </w:tc>
+      </w:tr>
+      <w:tr>
+        <w:tc>
+          <w:tcPr>
+            <w:tcW w:type="dxa" w:w="1296"/>
+          </w:tcPr>
+          <w:p>
+            <w:pPr>
+              <w:spacing w:after="20" w:before="20"/>
+            </w:pPr>
+            <w:r>
+              <w:rPr>
+                <w:rFonts w:ascii="Consolas" w:hAnsi="Consolas"/>
+                <w:b/>
+                <w:color w:val="C4007A"/>
+                <w:sz w:val="18"/>
+              </w:rPr>
+              <w:t>POST</w:t>
+            </w:r>
+          </w:p>
+        </w:tc>
+        <w:tc>
+          <w:tcPr>
+            <w:tcW w:type="dxa" w:w="3096"/>
+          </w:tcPr>
+          <w:p>
+            <w:pPr>
+              <w:spacing w:after="20" w:before="20"/>
+            </w:pPr>
+            <w:r>
+              <w:rPr>
+                <w:rFonts w:ascii="Consolas" w:hAnsi="Consolas"/>
+                <w:b w:val="0"/>
+                <w:color w:val="222222"/>
+                <w:sz w:val="18"/>
+              </w:rPr>
+              <w:t>/predict/dicom</w:t>
+            </w:r>
+          </w:p>
+        </w:tc>
+        <w:tc>
+          <w:tcPr>
+            <w:tcW w:type="dxa" w:w="5256"/>
+          </w:tcPr>
+          <w:p>
+            <w:pPr>
+              <w:spacing w:after="20" w:before="20"/>
+            </w:pPr>
+            <w:r>
+              <w:rPr>
+                <w:rFonts w:ascii="Calibri" w:hAnsi="Calibri"/>
+                <w:b w:val="0"/>
+                <w:color w:val="222222"/>
+                <w:sz w:val="18"/>
+              </w:rPr>
+              <w:t>Generate a report from a DICOM file, with windowing</w:t>
+            </w:r>
+          </w:p>
+        </w:tc>
+      </w:tr>
+      <w:tr>
+        <w:tc>
+          <w:tcPr>
+            <w:tcW w:type="dxa" w:w="1296"/>
+          </w:tcPr>
+          <w:p>
+            <w:pPr>
+              <w:spacing w:after="20" w:before="20"/>
+            </w:pPr>
+            <w:r>
+              <w:rPr>
+                <w:rFonts w:ascii="Consolas" w:hAnsi="Consolas"/>
+                <w:b/>
+                <w:color w:val="C4007A"/>
+                <w:sz w:val="18"/>
+              </w:rPr>
+              <w:t>POST</w:t>
+            </w:r>
+          </w:p>
+        </w:tc>
+        <w:tc>
+          <w:tcPr>
+            <w:tcW w:type="dxa" w:w="3096"/>
+          </w:tcPr>
+          <w:p>
+            <w:pPr>
+              <w:spacing w:after="20" w:before="20"/>
+            </w:pPr>
+            <w:r>
+              <w:rPr>
+                <w:rFonts w:ascii="Consolas" w:hAnsi="Consolas"/>
+                <w:b w:val="0"/>
+                <w:color w:val="222222"/>
+                <w:sz w:val="18"/>
+              </w:rPr>
+              <w:t>/preview/dicom</w:t>
+            </w:r>
+          </w:p>
+        </w:tc>
+        <w:tc>
+          <w:tcPr>
+            <w:tcW w:type="dxa" w:w="5256"/>
+          </w:tcPr>
+          <w:p>
+            <w:pPr>
+              <w:spacing w:after="20" w:before="20"/>
+            </w:pPr>
+            <w:r>
+              <w:rPr>
+                <w:rFonts w:ascii="Calibri" w:hAnsi="Calibri"/>
+                <w:b w:val="0"/>
+                <w:color w:val="222222"/>
+                <w:sz w:val="18"/>
+              </w:rPr>
+              <w:t>Return a windowed DICOM preview image (JPEG)</w:t>
+            </w:r>
+          </w:p>
+        </w:tc>
+      </w:tr>
+      <w:tr>
+        <w:tc>
+          <w:tcPr>
+            <w:tcW w:type="dxa" w:w="1296"/>
+          </w:tcPr>
+          <w:p>
+            <w:pPr>
+              <w:spacing w:after="20" w:before="20"/>
+            </w:pPr>
+            <w:r>
+              <w:rPr>
+                <w:rFonts w:ascii="Consolas" w:hAnsi="Consolas"/>
+                <w:b/>
+                <w:color w:val="C4007A"/>
+                <w:sz w:val="18"/>
+              </w:rPr>
+              <w:t>GET</w:t>
+            </w:r>
+          </w:p>
+        </w:tc>
+        <w:tc>
+          <w:tcPr>
+            <w:tcW w:type="dxa" w:w="3096"/>
+          </w:tcPr>
+          <w:p>
+            <w:pPr>
+              <w:spacing w:after="20" w:before="20"/>
+            </w:pPr>
+            <w:r>
+              <w:rPr>
+                <w:rFonts w:ascii="Consolas" w:hAnsi="Consolas"/>
+                <w:b w:val="0"/>
+                <w:color w:val="222222"/>
+                <w:sz w:val="18"/>
+              </w:rPr>
+              <w:t>/task/{task_id}</w:t>
+            </w:r>
+          </w:p>
+        </w:tc>
+        <w:tc>
+          <w:tcPr>
+            <w:tcW w:type="dxa" w:w="5256"/>
+          </w:tcPr>
+          <w:p>
+            <w:pPr>
+              <w:spacing w:after="20" w:before="20"/>
+            </w:pPr>
+            <w:r>
+              <w:rPr>
+                <w:rFonts w:ascii="Calibri" w:hAnsi="Calibri"/>
+                <w:b w:val="0"/>
+                <w:color w:val="222222"/>
+                <w:sz w:val="18"/>
+              </w:rPr>
+              <w:t>Poll the status and result of an async job</w:t>
+            </w:r>
+          </w:p>
+        </w:tc>
+      </w:tr>
+      <w:tr>
+        <w:tc>
+          <w:tcPr>
+            <w:tcW w:type="dxa" w:w="9648"/>
+            <w:gridSpan w:val="3"/>
+            <w:shd w:val="clear" w:color="auto" w:fill="EFE7FA"/>
+          </w:tcPr>
+          <w:p>
+            <w:pPr>
+              <w:spacing w:after="20" w:before="20"/>
+            </w:pPr>
+            <w:r>
+              <w:rPr>
+                <w:rFonts w:ascii="Calibri" w:hAnsi="Calibri"/>
+                <w:b/>
+                <w:color w:val="4B2E83"/>
+                <w:sz w:val="18"/>
+              </w:rPr>
+              <w:t>AGENT</w:t>
+            </w:r>
+          </w:p>
+        </w:tc>
+      </w:tr>
+      <w:tr>
+        <w:tc>
+          <w:tcPr>
+            <w:tcW w:type="dxa" w:w="1296"/>
+          </w:tcPr>
+          <w:p>
+            <w:pPr>
+              <w:spacing w:after="20" w:before="20"/>
+            </w:pPr>
+            <w:r>
+              <w:rPr>
+                <w:rFonts w:ascii="Consolas" w:hAnsi="Consolas"/>
+                <w:b/>
+                <w:color w:val="C4007A"/>
+                <w:sz w:val="18"/>
+              </w:rPr>
+              <w:t>POST</w:t>
+            </w:r>
+          </w:p>
+        </w:tc>
+        <w:tc>
+          <w:tcPr>
+            <w:tcW w:type="dxa" w:w="3096"/>
+          </w:tcPr>
+          <w:p>
+            <w:pPr>
+              <w:spacing w:after="20" w:before="20"/>
+            </w:pPr>
+            <w:r>
+              <w:rPr>
+                <w:rFonts w:ascii="Consolas" w:hAnsi="Consolas"/>
+                <w:b w:val="0"/>
+                <w:color w:val="222222"/>
+                <w:sz w:val="18"/>
+              </w:rPr>
+              <w:t>/agent/query</w:t>
+            </w:r>
+          </w:p>
+        </w:tc>
+        <w:tc>
+          <w:tcPr>
+            <w:tcW w:type="dxa" w:w="5256"/>
+          </w:tcPr>
+          <w:p>
+            <w:pPr>
+              <w:spacing w:after="20" w:before="20"/>
+            </w:pPr>
+            <w:r>
+              <w:rPr>
+                <w:rFonts w:ascii="Calibri" w:hAnsi="Calibri"/>
+                <w:b w:val="0"/>
+                <w:color w:val="222222"/>
+                <w:sz w:val="18"/>
+              </w:rPr>
+              <w:t>Grounded clinical question answering (optional reasoning trace)</w:t>
+            </w:r>
+          </w:p>
+        </w:tc>
+      </w:tr>
+      <w:tr>
+        <w:tc>
+          <w:tcPr>
+            <w:tcW w:type="dxa" w:w="1296"/>
+          </w:tcPr>
+          <w:p>
+            <w:pPr>
+              <w:spacing w:after="20" w:before="20"/>
+            </w:pPr>
+            <w:r>
+              <w:rPr>
+                <w:rFonts w:ascii="Consolas" w:hAnsi="Consolas"/>
+                <w:b/>
+                <w:color w:val="C4007A"/>
+                <w:sz w:val="18"/>
+              </w:rPr>
+              <w:t>POST</w:t>
+            </w:r>
+          </w:p>
+        </w:tc>
+        <w:tc>
+          <w:tcPr>
+            <w:tcW w:type="dxa" w:w="3096"/>
+          </w:tcPr>
+          <w:p>
+            <w:pPr>
+              <w:spacing w:after="20" w:before="20"/>
+            </w:pPr>
+            <w:r>
+              <w:rPr>
+                <w:rFonts w:ascii="Consolas" w:hAnsi="Consolas"/>
+                <w:b w:val="0"/>
+                <w:color w:val="222222"/>
+                <w:sz w:val="18"/>
+              </w:rPr>
+              <w:t>/agent/search</w:t>
+            </w:r>
+          </w:p>
+        </w:tc>
+        <w:tc>
+          <w:tcPr>
+            <w:tcW w:type="dxa" w:w="5256"/>
+          </w:tcPr>
+          <w:p>
+            <w:pPr>
+              <w:spacing w:after="20" w:before="20"/>
+            </w:pPr>
+            <w:r>
+              <w:rPr>
+                <w:rFonts w:ascii="Calibri" w:hAnsi="Calibri"/>
+                <w:b w:val="0"/>
+                <w:color w:val="222222"/>
+                <w:sz w:val="18"/>
+              </w:rPr>
+              <w:t>Semantic search over indexed reports</w:t>
+            </w:r>
+          </w:p>
+        </w:tc>
+      </w:tr>
+      <w:tr>
+        <w:tc>
+          <w:tcPr>
+            <w:tcW w:type="dxa" w:w="1296"/>
+          </w:tcPr>
+          <w:p>
+            <w:pPr>
+              <w:spacing w:after="20" w:before="20"/>
+            </w:pPr>
+            <w:r>
+              <w:rPr>
+                <w:rFonts w:ascii="Consolas" w:hAnsi="Consolas"/>
+                <w:b/>
+                <w:color w:val="C4007A"/>
+                <w:sz w:val="18"/>
+              </w:rPr>
+              <w:t>POST</w:t>
+            </w:r>
+          </w:p>
+        </w:tc>
+        <w:tc>
+          <w:tcPr>
+            <w:tcW w:type="dxa" w:w="3096"/>
+          </w:tcPr>
+          <w:p>
+            <w:pPr>
+              <w:spacing w:after="20" w:before="20"/>
+            </w:pPr>
+            <w:r>
+              <w:rPr>
+                <w:rFonts w:ascii="Consolas" w:hAnsi="Consolas"/>
+                <w:b w:val="0"/>
+                <w:color w:val="222222"/>
+                <w:sz w:val="18"/>
+              </w:rPr>
+              <w:t>/agent/index</w:t>
+            </w:r>
+          </w:p>
+        </w:tc>
+        <w:tc>
+          <w:tcPr>
+            <w:tcW w:type="dxa" w:w="5256"/>
+          </w:tcPr>
+          <w:p>
+            <w:pPr>
+              <w:spacing w:after="20" w:before="20"/>
+            </w:pPr>
+            <w:r>
+              <w:rPr>
+                <w:rFonts w:ascii="Calibri" w:hAnsi="Calibri"/>
+                <w:b w:val="0"/>
+                <w:color w:val="222222"/>
+                <w:sz w:val="18"/>
+              </w:rPr>
+              <w:t>Add reports to the vector store</w:t>
+            </w:r>
+          </w:p>
+        </w:tc>
+      </w:tr>
+      <w:tr>
+        <w:tc>
+          <w:tcPr>
+            <w:tcW w:type="dxa" w:w="1296"/>
+          </w:tcPr>
+          <w:p>
+            <w:pPr>
+              <w:spacing w:after="20" w:before="20"/>
+            </w:pPr>
+            <w:r>
+              <w:rPr>
+                <w:rFonts w:ascii="Consolas" w:hAnsi="Consolas"/>
+                <w:b/>
+                <w:color w:val="C4007A"/>
+                <w:sz w:val="18"/>
+              </w:rPr>
+              <w:t>DELETE</w:t>
+            </w:r>
+          </w:p>
+        </w:tc>
+        <w:tc>
+          <w:tcPr>
+            <w:tcW w:type="dxa" w:w="3096"/>
+          </w:tcPr>
+          <w:p>
+            <w:pPr>
+              <w:spacing w:after="20" w:before="20"/>
+            </w:pPr>
+            <w:r>
+              <w:rPr>
+                <w:rFonts w:ascii="Consolas" w:hAnsi="Consolas"/>
+                <w:b w:val="0"/>
+                <w:color w:val="222222"/>
+                <w:sz w:val="18"/>
+              </w:rPr>
+              <w:t>/agent/index</w:t>
+            </w:r>
+          </w:p>
+        </w:tc>
+        <w:tc>
+          <w:tcPr>
+            <w:tcW w:type="dxa" w:w="5256"/>
+          </w:tcPr>
+          <w:p>
+            <w:pPr>
+              <w:spacing w:after="20" w:before="20"/>
+            </w:pPr>
+            <w:r>
+              <w:rPr>
+                <w:rFonts w:ascii="Calibri" w:hAnsi="Calibri"/>
+                <w:b w:val="0"/>
+                <w:color w:val="222222"/>
+                <w:sz w:val="18"/>
+              </w:rPr>
+              <w:t>Delete the vector store collection</w:t>
+            </w:r>
+          </w:p>
+        </w:tc>
+      </w:tr>
+      <w:tr>
+        <w:tc>
+          <w:tcPr>
+            <w:tcW w:type="dxa" w:w="1296"/>
+          </w:tcPr>
+          <w:p>
+            <w:pPr>
+              <w:spacing w:after="20" w:before="20"/>
+            </w:pPr>
+            <w:r>
+              <w:rPr>
+                <w:rFonts w:ascii="Consolas" w:hAnsi="Consolas"/>
+                <w:b/>
+                <w:color w:val="C4007A"/>
+                <w:sz w:val="18"/>
+              </w:rPr>
+              <w:t>GET</w:t>
+            </w:r>
+          </w:p>
+        </w:tc>
+        <w:tc>
+          <w:tcPr>
+            <w:tcW w:type="dxa" w:w="3096"/>
+          </w:tcPr>
+          <w:p>
+            <w:pPr>
+              <w:spacing w:after="20" w:before="20"/>
+            </w:pPr>
+            <w:r>
+              <w:rPr>
+                <w:rFonts w:ascii="Consolas" w:hAnsi="Consolas"/>
+                <w:b w:val="0"/>
+                <w:color w:val="222222"/>
+                <w:sz w:val="18"/>
+              </w:rPr>
+              <w:t>/agent/stats</w:t>
+            </w:r>
+          </w:p>
+        </w:tc>
+        <w:tc>
+          <w:tcPr>
+            <w:tcW w:type="dxa" w:w="5256"/>
+          </w:tcPr>
+          <w:p>
+            <w:pPr>
+              <w:spacing w:after="20" w:before="20"/>
+            </w:pPr>
+            <w:r>
+              <w:rPr>
+                <w:rFonts w:ascii="Calibri" w:hAnsi="Calibri"/>
+                <w:b w:val="0"/>
+                <w:color w:val="222222"/>
+                <w:sz w:val="18"/>
+              </w:rPr>
+              <w:t>Vector store statistics (backend and count)</w:t>
+            </w:r>
+          </w:p>
+        </w:tc>
+      </w:tr>
+    </w:tbl>
+    <w:p>
+      <w:pPr>
+        <w:spacing w:before="120"/>
+      </w:pPr>
+      <w:r>
+        <w:rPr>
+          <w:i/>
+          <w:color w:val="666666"/>
+          <w:sz w:val="18"/>
+        </w:rPr>
+        <w:t>Interactive requests support both synchronous and asynchronous (Celery) modes; responses include the generated report, a confidence score, and processing time.</w:t>
       </w:r>
     </w:p>
     <w:sectPr>

</xml_diff>

<commit_message>
Improve written report: refine prose, add trend and strategy diagrams, expand references
</commit_message>
<xml_diff>
--- a/deliverables/Nitish_Kumar_Report.docx
+++ b/deliverables/Nitish_Kumar_Report.docx
@@ -84,7 +84,7 @@
         <w:jc w:val="both"/>
       </w:pPr>
       <w:r>
-        <w:t>Clinical Natural Language Technology is a group of computer methods. They turn messy medical information into clean, structured data. This information includes doctor notes, discharge summaries, scanned faxes, and medical images. About 80% of health data is messy like this. It sits in plain text and in pictures. Computers cannot search it, code it, or audit it directly. Four technologies do the work. Natural Language Processing (NLP) reads text and pulls out facts. Optical Character Recognition (OCR) turns scanned paper into digital text. Computer Vision (CV) reads medical images. Large Language Models (LLMs) and Large Multimodal Models (LMMs) handle text and images together. Together these methods turn written medical content into codes and evidence. Payment integrity and quality teams depend on that output.</w:t>
+        <w:t>Clinical Natural Language Technology is a family of computational methods that convert unstructured medical information, such as physician notes, discharge summaries, scanned faxes, and diagnostic images, into clean, structured, machine-readable data. An estimated 80% of healthcare data is unstructured, locked in free text and pictures that systems cannot directly search, code, or audit. Five complementary technologies do this work. Natural Language Processing (NLP) extracts facts and clinical entities from text. Optical Character Recognition (OCR) digitizes scanned and faxed documents. Computer Vision (CV) interprets medical images. Large Language Models (LLMs) and Large Multimodal Models (LMMs) reason over text and images together. Collectively, they translate narrative medical content into the codes and supporting evidence that payment-integrity, risk-adjustment, and quality teams rely on every day.</w:t>
       </w:r>
     </w:p>
     <w:p>
@@ -110,7 +110,61 @@
         <w:jc w:val="both"/>
       </w:pPr>
       <w:r>
-        <w:t>The field has gone through three stages. The first stage ran from 2000 to 2017. It used rules and word lists. Tools like cTAKES and MetaMap matched text to standard code sets such as UMLS, SNOMED CT, and ICD. They were accurate. But they broke easily, and they cost a lot to maintain. The second stage ran from 2018 to 2023. Transformer models took over. Models trained on medical text, such as BioBERT, ClinicalBERT, and GatorTron, worked much better. They improved entity recognition, de-identification, and phenotyping. Vision models like DenseNet reached expert-level accuracy on chest X-rays. The third stage started in 2024. It is generative and multimodal. Clinical LLMs such as Med-PaLM 2 hold broad medical knowledge. LMMs read an image and text together. One model can now read an X-ray and write a draft report. Retrieval-Augmented Generation (RAG) is the standard way to keep these models honest. RAG grounds each answer in a trusted source. It limits hallucination, which means made-up facts. Healthcare cannot use these models safely without that grounding.</w:t>
+        <w:t>The field has evolved through three overlapping eras, summarized in Figure 1. From roughly 2000 to 2017, rule-based systems such as cTAKES and MetaMap mapped text to standard terminologies including UMLS, SNOMED CT, ICD, and LOINC. These systems were precise and transparent, but brittle and expensive to maintain. From 2018 to 2023, transformer models trained on clinical text, such as BioBERT, ClinicalBERT, and GatorTron, sharply improved entity recognition, de-identification, and phenotyping, while vision models such as DenseNet reached radiologist-level performance on chest-film findings (Rajpurkar et al., 2017). Since 2024, the frontier has become generative and multimodal. Clinical LLMs such as Med-PaLM 2 encode broad medical knowledge, and LMMs interpret an image together with its clinical context, so a single model can read an X-ray and draft a report. Retrieval-Augmented Generation (RAG) has become the standard safeguard, grounding each answer in a trusted source to curb hallucination (confident but false output). In regulated healthcare, that grounding is a prerequisite, not an option.</w:t>
+      </w:r>
+    </w:p>
+    <w:p>
+      <w:pPr>
+        <w:spacing w:before="80" w:after="40"/>
+        <w:jc w:val="center"/>
+      </w:pPr>
+      <w:r>
+        <w:drawing>
+          <wp:inline xmlns:a="http://schemas.openxmlformats.org/drawingml/2006/main" xmlns:pic="http://schemas.openxmlformats.org/drawingml/2006/picture">
+            <wp:extent cx="5852160" cy="1877168"/>
+            <wp:docPr id="1" name="Picture 1"/>
+            <wp:cNvGraphicFramePr>
+              <a:graphicFrameLocks noChangeAspect="1"/>
+            </wp:cNvGraphicFramePr>
+            <a:graphic>
+              <a:graphicData uri="http://schemas.openxmlformats.org/drawingml/2006/picture">
+                <pic:pic>
+                  <pic:nvPicPr>
+                    <pic:cNvPr id="0" name="trends_timeline.png"/>
+                    <pic:cNvPicPr/>
+                  </pic:nvPicPr>
+                  <pic:blipFill>
+                    <a:blip r:embed="rId9"/>
+                    <a:stretch>
+                      <a:fillRect/>
+                    </a:stretch>
+                  </pic:blipFill>
+                  <pic:spPr>
+                    <a:xfrm>
+                      <a:off x="0" y="0"/>
+                      <a:ext cx="5852160" cy="1877168"/>
+                    </a:xfrm>
+                    <a:prstGeom prst="rect"/>
+                  </pic:spPr>
+                </pic:pic>
+              </a:graphicData>
+            </a:graphic>
+          </wp:inline>
+        </w:drawing>
+      </w:r>
+    </w:p>
+    <w:p>
+      <w:pPr>
+        <w:spacing w:after="120"/>
+        <w:jc w:val="center"/>
+      </w:pPr>
+      <w:r>
+        <w:rPr>
+          <w:i/>
+          <w:color w:val="666666"/>
+          <w:sz w:val="18"/>
+        </w:rPr>
+        <w:t>Figure 1. Evolution of clinical natural language technology across three eras.</w:t>
       </w:r>
     </w:p>
     <w:p>
@@ -145,7 +199,7 @@
         <w:t xml:space="preserve">Automated coding and payment integrity: </w:t>
       </w:r>
       <w:r>
-        <w:t>read notes and pull out diagnoses, procedures, and evidence. This finds miscoding, upcoding, and missing documentation at scale. It matches Cotiviti's main business.</w:t>
+        <w:t>extract diagnoses, procedures, and supporting evidence from notes to surface miscoding, upcoding, and documentation gaps at scale. This aligns directly with Cotiviti's prepay and postpay review and risk-adjustment work.</w:t>
       </w:r>
     </w:p>
     <w:p>
@@ -159,10 +213,10 @@
           <w:b/>
           <w:color w:val="4B2E83"/>
         </w:rPr>
-        <w:t xml:space="preserve">Multimodal report generation: </w:t>
+        <w:t xml:space="preserve">Multimodal claim validation: </w:t>
       </w:r>
       <w:r>
-        <w:t>models write draft radiology and pathology reports. This saves time. It also shows findings that agree or disagree with a billed claim.</w:t>
+        <w:t>draft radiology and pathology reports and compare imaging against notes and billed claims, highlighting findings that support or contradict a submission.</w:t>
       </w:r>
     </w:p>
     <w:p>
@@ -179,7 +233,7 @@
         <w:t xml:space="preserve">Grounded and auditable AI: </w:t>
       </w:r>
       <w:r>
-        <w:t>RAG shows the exact source text behind every result. This gives the audit trail that clinical and regulatory review need.</w:t>
+        <w:t>Retrieval-Augmented Generation surfaces the exact source text behind every determination, producing the audit trail that clinical and regulatory review require.</w:t>
       </w:r>
     </w:p>
     <w:p>
@@ -214,7 +268,7 @@
         <w:t xml:space="preserve">Hallucination and safety: </w:t>
       </w:r>
       <w:r>
-        <w:t>these models can state facts that sound right but are wrong. In payment and care decisions, that is not acceptable.</w:t>
+        <w:t>models can produce confident but false statements, which is unacceptable in payment and care decisions and must be controlled through grounding and human review.</w:t>
       </w:r>
     </w:p>
     <w:p>
@@ -231,7 +285,7 @@
         <w:t xml:space="preserve">Privacy and compliance: </w:t>
       </w:r>
       <w:r>
-        <w:t>patient data in text and images needs strong de-identification. It also needs private hosting and strict data rules.</w:t>
+        <w:t>protected health information in text and images demands rigorous de-identification, private HIPAA-aligned hosting, and strict data governance.</w:t>
       </w:r>
     </w:p>
     <w:p>
@@ -248,7 +302,7 @@
         <w:t xml:space="preserve">Bias, drift, and regulation: </w:t>
       </w:r>
       <w:r>
-        <w:t>models can work worse for some groups. They lose accuracy when coding rules change. Rules from the FDA and from payers keep growing.</w:t>
+        <w:t>performance can vary across patient subgroups and degrade as coding rules change, all under expanding FDA and payer oversight of clinical AI.</w:t>
       </w:r>
     </w:p>
     <w:p>
@@ -274,7 +328,61 @@
         <w:jc w:val="both"/>
       </w:pPr>
       <w:r>
-        <w:t>First, build a clinical NLP layer on top of RAG. Use medical encoders such as ClinicalBERT or GatorTron. Connect them to a managed store of coding policies and clinical guidelines. Every code or flag the AI produces should point back to a named source. Second, run a pilot on multimodal documents. Combine OCR, NLP, and computer vision. Use it to check imaging and notes against submitted claims. Third, keep a human in the loop. Track versions. Check calibration. Watch for drift. Send low-confidence cases to a person. Automation should help expert reviewers, not replace them. These three steps give Cotiviti speed. They also meet the accuracy, clarity, and compliance bar that payment integrity work needs.</w:t>
+        <w:t>Three actions, illustrated in Figure 2, would let Cotiviti capture these opportunities while managing the risks. First, build a grounded clinical-NLP layer that pairs medical encoders such as ClinicalBERT or GatorTron with a Retrieval-Augmented Generation index of coding policies and clinical guidelines, so every code or flag the system produces links back to a named, auditable source. Second, pilot multimodal document understanding that combines OCR, NLP, and computer vision to reconcile imaging and notes against submitted claims, catching gaps that text-only review misses. Third, keep experts in the loop by versioning models, monitoring calibration and drift, and routing low-confidence cases to human reviewers, so automation augments rather than replaces them. Together, these steps give Cotiviti speed while meeting the accuracy, transparency, and compliance bar that payment-integrity work demands.</w:t>
+      </w:r>
+    </w:p>
+    <w:p>
+      <w:pPr>
+        <w:spacing w:before="80" w:after="40"/>
+        <w:jc w:val="center"/>
+      </w:pPr>
+      <w:r>
+        <w:drawing>
+          <wp:inline xmlns:a="http://schemas.openxmlformats.org/drawingml/2006/main" xmlns:pic="http://schemas.openxmlformats.org/drawingml/2006/picture">
+            <wp:extent cx="5852160" cy="1630930"/>
+            <wp:docPr id="2" name="Picture 2"/>
+            <wp:cNvGraphicFramePr>
+              <a:graphicFrameLocks noChangeAspect="1"/>
+            </wp:cNvGraphicFramePr>
+            <a:graphic>
+              <a:graphicData uri="http://schemas.openxmlformats.org/drawingml/2006/picture">
+                <pic:pic>
+                  <pic:nvPicPr>
+                    <pic:cNvPr id="0" name="strategy_actions.png"/>
+                    <pic:cNvPicPr/>
+                  </pic:nvPicPr>
+                  <pic:blipFill>
+                    <a:blip r:embed="rId10"/>
+                    <a:stretch>
+                      <a:fillRect/>
+                    </a:stretch>
+                  </pic:blipFill>
+                  <pic:spPr>
+                    <a:xfrm>
+                      <a:off x="0" y="0"/>
+                      <a:ext cx="5852160" cy="1630930"/>
+                    </a:xfrm>
+                    <a:prstGeom prst="rect"/>
+                  </pic:spPr>
+                </pic:pic>
+              </a:graphicData>
+            </a:graphic>
+          </wp:inline>
+        </w:drawing>
+      </w:r>
+    </w:p>
+    <w:p>
+      <w:pPr>
+        <w:spacing w:after="120"/>
+        <w:jc w:val="center"/>
+      </w:pPr>
+      <w:r>
+        <w:rPr>
+          <w:i/>
+          <w:color w:val="666666"/>
+          <w:sz w:val="18"/>
+        </w:rPr>
+        <w:t>Figure 2. Three recommended strategic actions for Cotiviti.</w:t>
       </w:r>
     </w:p>
     <w:p>
@@ -440,6 +548,19 @@
         <w:rPr>
           <w:sz w:val="20"/>
         </w:rPr>
+        <w:t>Rajpurkar, P., Irvin, J., Zhu, K., Yang, B., Mehta, H., Duan, T., ... Ng, A. Y. (2017). CheXNet: Radiologist-level pneumonia detection on chest X-rays with deep learning. arXiv:1711.05225.</w:t>
+      </w:r>
+    </w:p>
+    <w:p>
+      <w:pPr>
+        <w:spacing w:after="160" w:line="276" w:lineRule="auto"/>
+        <w:ind w:left="720" w:hanging="720"/>
+        <w:jc w:val="both"/>
+      </w:pPr>
+      <w:r>
+        <w:rPr>
+          <w:sz w:val="20"/>
+        </w:rPr>
         <w:t>Singhal, K., Azizi, S., Tu, T., Mahdavi, S. S., Wei, J., Chung, H. W., ... Natarajan, V. (2023). Large language models encode clinical knowledge. Nature, 620, 172–180.</w:t>
       </w:r>
     </w:p>
@@ -522,7 +643,7 @@
         <w:drawing>
           <wp:inline xmlns:a="http://schemas.openxmlformats.org/drawingml/2006/main" xmlns:pic="http://schemas.openxmlformats.org/drawingml/2006/picture">
             <wp:extent cx="5577840" cy="3175608"/>
-            <wp:docPr id="1" name="Picture 1"/>
+            <wp:docPr id="3" name="Picture 3"/>
             <wp:cNvGraphicFramePr>
               <a:graphicFrameLocks noChangeAspect="1"/>
             </wp:cNvGraphicFramePr>
@@ -534,7 +655,7 @@
                     <pic:cNvPicPr/>
                   </pic:nvPicPr>
                   <pic:blipFill>
-                    <a:blip r:embed="rId9"/>
+                    <a:blip r:embed="rId11"/>
                     <a:stretch>
                       <a:fillRect/>
                     </a:stretch>
@@ -563,7 +684,7 @@
           <w:color w:val="666666"/>
           <w:sz w:val="18"/>
         </w:rPr>
-        <w:t>Figure 1. High-level design of the Chest X-Ray Report Generation System.</w:t>
+        <w:t>Figure 3. High-level design of the Chest X-Ray Report Generation System.</w:t>
       </w:r>
     </w:p>
     <w:p>

</xml_diff>